<commit_message>
Législation : réseau finalisé du 01/10 mis en ligne (feu vert F. Henninot, 02/10)
Carnet élève 124 p. (P1-P5) et PDF, livret professeur, guide pédagogique,
mission finale, 8 stations corrigées (RT, RE2020, F-Gaz 3, habilitation,
terre/différentiel, PAC et voisinage, DESP), Three.js local avec licence.
Reporté depuis la branche chantier-2026-09-30 (fichiers legislation/ seuls).
Contrôle verifier-livraison : 61 pages, 652 ressources, 57 missions,
64 réponses HTTP, aucune erreur. Clés ?v= recalculées (b714a64f0f).

Co-Authored-By: Claude Opus 5.5 <noreply@anthropic.com>
</commit_message>
<xml_diff>
--- a/legislation/carnet/carnet-eleve-P1.docx
+++ b/legislation/carnet/carnet-eleve-P1.docx
@@ -25,7 +25,7 @@
                     </pic:cNvPicPr>
                   </pic:nvPicPr>
                   <pic:blipFill>
-                    <a:blip r:embed="rId35" cstate="none"/>
+                    <a:blip r:embed="rId37" cstate="none"/>
                     <a:srcRect/>
                     <a:stretch>
                       <a:fillRect/>
@@ -1835,7 +1835,7 @@
           <w:sz w:val="28"/>
           <w:szCs w:val="28"/>
         </w:rPr>
-        <w:t xml:space="preserve">Ma pièce : je la prépare ici, puis je la rends</w:t>
+        <w:t xml:space="preserve">Ma pièce : brouillon ici, feuille jointe si nécessaire</w:t>
       </w:r>
     </w:p>
     <w:tbl>
@@ -2134,7 +2134,7 @@
                           </pic:cNvPicPr>
                         </pic:nvPicPr>
                         <pic:blipFill>
-                          <a:blip r:embed="rId36" cstate="none"/>
+                          <a:blip r:embed="rId38" cstate="none"/>
                           <a:srcRect/>
                           <a:stretch>
                             <a:fillRect/>
@@ -3516,7 +3516,7 @@
           <w:sz w:val="28"/>
           <w:szCs w:val="28"/>
         </w:rPr>
-        <w:t xml:space="preserve">Ma pièce : je la prépare ici, puis je la rends</w:t>
+        <w:t xml:space="preserve">Ma pièce : brouillon ici, feuille jointe si nécessaire</w:t>
       </w:r>
     </w:p>
     <w:tbl>
@@ -3853,7 +3853,7 @@
                           </pic:cNvPicPr>
                         </pic:nvPicPr>
                         <pic:blipFill>
-                          <a:blip r:embed="rId37" cstate="none"/>
+                          <a:blip r:embed="rId39" cstate="none"/>
                           <a:srcRect/>
                           <a:stretch>
                             <a:fillRect/>
@@ -5247,7 +5247,7 @@
           <w:sz w:val="28"/>
           <w:szCs w:val="28"/>
         </w:rPr>
-        <w:t xml:space="preserve">Ma pièce : je la prépare ici, puis je la rends</w:t>
+        <w:t xml:space="preserve">Ma pièce : brouillon ici, feuille jointe si nécessaire</w:t>
       </w:r>
     </w:p>
     <w:tbl>
@@ -5546,7 +5546,7 @@
                           </pic:cNvPicPr>
                         </pic:nvPicPr>
                         <pic:blipFill>
-                          <a:blip r:embed="rId38" cstate="none"/>
+                          <a:blip r:embed="rId40" cstate="none"/>
                           <a:srcRect/>
                           <a:stretch>
                             <a:fillRect/>
@@ -6938,7 +6938,7 @@
           <w:sz w:val="28"/>
           <w:szCs w:val="28"/>
         </w:rPr>
-        <w:t xml:space="preserve">Ma pièce : je la prépare ici, puis je la rends</w:t>
+        <w:t xml:space="preserve">Ma pièce : brouillon ici, feuille jointe si nécessaire</w:t>
       </w:r>
     </w:p>
     <w:tbl>
@@ -7275,7 +7275,7 @@
                           </pic:cNvPicPr>
                         </pic:nvPicPr>
                         <pic:blipFill>
-                          <a:blip r:embed="rId39" cstate="none"/>
+                          <a:blip r:embed="rId41" cstate="none"/>
                           <a:srcRect/>
                           <a:stretch>
                             <a:fillRect/>
@@ -8681,7 +8681,7 @@
           <w:sz w:val="28"/>
           <w:szCs w:val="28"/>
         </w:rPr>
-        <w:t xml:space="preserve">Ma pièce : je la prépare ici, puis je la rends</w:t>
+        <w:t xml:space="preserve">Ma pièce : brouillon ici, feuille jointe si nécessaire</w:t>
       </w:r>
     </w:p>
     <w:tbl>
@@ -9018,7 +9018,7 @@
                           </pic:cNvPicPr>
                         </pic:nvPicPr>
                         <pic:blipFill>
-                          <a:blip r:embed="rId40" cstate="none"/>
+                          <a:blip r:embed="rId42" cstate="none"/>
                           <a:srcRect/>
                           <a:stretch>
                             <a:fillRect/>
@@ -10412,7 +10412,7 @@
           <w:sz w:val="28"/>
           <w:szCs w:val="28"/>
         </w:rPr>
-        <w:t xml:space="preserve">Ma pièce : je la prépare ici, puis je la rends</w:t>
+        <w:t xml:space="preserve">Ma pièce : brouillon ici, feuille jointe si nécessaire</w:t>
       </w:r>
     </w:p>
     <w:tbl>
@@ -10749,7 +10749,7 @@
                           </pic:cNvPicPr>
                         </pic:nvPicPr>
                         <pic:blipFill>
-                          <a:blip r:embed="rId41" cstate="none"/>
+                          <a:blip r:embed="rId43" cstate="none"/>
                           <a:srcRect/>
                           <a:stretch>
                             <a:fillRect/>
@@ -12158,7 +12158,7 @@
           <w:sz w:val="28"/>
           <w:szCs w:val="28"/>
         </w:rPr>
-        <w:t xml:space="preserve">Ma pièce : je la prépare ici, puis je la rends</w:t>
+        <w:t xml:space="preserve">Ma pièce : brouillon ici, feuille jointe si nécessaire</w:t>
       </w:r>
     </w:p>
     <w:tbl>
@@ -12419,7 +12419,7 @@
                           </pic:cNvPicPr>
                         </pic:nvPicPr>
                         <pic:blipFill>
-                          <a:blip r:embed="rId42" cstate="none"/>
+                          <a:blip r:embed="rId44" cstate="none"/>
                           <a:srcRect/>
                           <a:stretch>
                             <a:fillRect/>
@@ -13811,7 +13811,7 @@
           <w:sz w:val="28"/>
           <w:szCs w:val="28"/>
         </w:rPr>
-        <w:t xml:space="preserve">Ma pièce : je la prépare ici, puis je la rends</w:t>
+        <w:t xml:space="preserve">Ma pièce : brouillon ici, feuille jointe si nécessaire</w:t>
       </w:r>
     </w:p>
     <w:tbl>
@@ -14224,7 +14224,7 @@
                           </pic:cNvPicPr>
                         </pic:nvPicPr>
                         <pic:blipFill>
-                          <a:blip r:embed="rId43" cstate="none"/>
+                          <a:blip r:embed="rId45" cstate="none"/>
                           <a:srcRect/>
                           <a:stretch>
                             <a:fillRect/>
@@ -14775,7 +14775,7 @@
           <w:sz w:val="28"/>
           <w:szCs w:val="28"/>
         </w:rPr>
-        <w:t xml:space="preserve">Que compare un dispositif différentiel, et quelle sensibilité retient-on pour protéger les personnes ? Citez deux cas où l'INRS la rend obligatoire. </w:t>
+        <w:t xml:space="preserve">Que compare un dispositif différentiel, et quelle sensibilité retient-on pour protéger les personnes ? Citez deux cas d’obligation présentés dans la documentation INRS. </w:t>
       </w:r>
       <w:r>
         <w:rPr>
@@ -15616,7 +15616,7 @@
           <w:sz w:val="28"/>
           <w:szCs w:val="28"/>
         </w:rPr>
-        <w:t xml:space="preserve">Ma pièce : je la prépare ici, puis je la rends</w:t>
+        <w:t xml:space="preserve">Ma pièce : brouillon ici, feuille jointe si nécessaire</w:t>
       </w:r>
     </w:p>
     <w:tbl>
@@ -15915,7 +15915,7 @@
                           </pic:cNvPicPr>
                         </pic:nvPicPr>
                         <pic:blipFill>
-                          <a:blip r:embed="rId44" cstate="none"/>
+                          <a:blip r:embed="rId46" cstate="none"/>
                           <a:srcRect/>
                           <a:stretch>
                             <a:fillRect/>
@@ -17283,7 +17283,7 @@
           <w:sz w:val="28"/>
           <w:szCs w:val="28"/>
         </w:rPr>
-        <w:t xml:space="preserve">Ma pièce : je la prépare ici, puis je la rends</w:t>
+        <w:t xml:space="preserve">Ma pièce : brouillon ici, feuille jointe si nécessaire</w:t>
       </w:r>
     </w:p>
     <w:tbl>
@@ -17582,7 +17582,7 @@
                           </pic:cNvPicPr>
                         </pic:nvPicPr>
                         <pic:blipFill>
-                          <a:blip r:embed="rId45" cstate="none"/>
+                          <a:blip r:embed="rId47" cstate="none"/>
                           <a:srcRect/>
                           <a:stretch>
                             <a:fillRect/>
@@ -18961,7 +18961,7 @@
           <w:sz w:val="28"/>
           <w:szCs w:val="28"/>
         </w:rPr>
-        <w:t xml:space="preserve">Ma pièce : je la prépare ici, puis je la rends</w:t>
+        <w:t xml:space="preserve">Ma pièce : brouillon ici, feuille jointe si nécessaire</w:t>
       </w:r>
     </w:p>
     <w:tbl>
@@ -19336,7 +19336,7 @@
                           </pic:cNvPicPr>
                         </pic:nvPicPr>
                         <pic:blipFill>
-                          <a:blip r:embed="rId46" cstate="none"/>
+                          <a:blip r:embed="rId48" cstate="none"/>
                           <a:srcRect/>
                           <a:stretch>
                             <a:fillRect/>
@@ -20203,7 +20203,7 @@
                 <w:sz w:val="28"/>
                 <w:szCs w:val="28"/>
               </w:rPr>
-              <w:t xml:space="preserve">Nettoyer un local technique en basse tension, près de pièces nues sous tension, sans toucher à l'installation</w:t>
+              <w:t xml:space="preserve">Nettoyer un local en basse tension dans la zone de voisinage simple délimitée, sans entrer en zone de voisinage renforcé</w:t>
             </w:r>
           </w:p>
           <w:p>
@@ -20707,7 +20707,7 @@
           <w:sz w:val="28"/>
           <w:szCs w:val="28"/>
         </w:rPr>
-        <w:t xml:space="preserve">Ma pièce : je la prépare ici, puis je la rends</w:t>
+        <w:t xml:space="preserve">Ma pièce : brouillon ici, feuille jointe si nécessaire</w:t>
       </w:r>
     </w:p>
     <w:tbl>
@@ -21006,7 +21006,7 @@
                           </pic:cNvPicPr>
                         </pic:nvPicPr>
                         <pic:blipFill>
-                          <a:blip r:embed="rId47" cstate="none"/>
+                          <a:blip r:embed="rId49" cstate="none"/>
                           <a:srcRect/>
                           <a:stretch>
                             <a:fillRect/>
@@ -23667,8 +23667,412 @@
         </w:tc>
       </w:tr>
     </w:tbl>
+    <w:p>
+      <w:pPr>
+        <w:sectPr>
+          <w:footerReference w:type="default" r:id="rId33"/>
+          <w:pgSz w:w="11906" w:h="16838" w:orient="portrait"/>
+          <w:pgMar w:top="624" w:right="680" w:bottom="1191" w:left="680" w:header="708" w:footer="284" w:gutter="0"/>
+          <w:pgNumType/>
+          <w:docGrid w:linePitch="360"/>
+        </w:sectPr>
+      </w:pPr>
+    </w:p>
+    <w:p>
+      <w:pPr>
+        <w:spacing w:after="100"/>
+      </w:pPr>
+      <w:r>
+        <w:rPr>
+          <w:rFonts w:ascii="Trebuchet MS" w:cs="Trebuchet MS" w:eastAsia="Trebuchet MS" w:hAnsi="Trebuchet MS"/>
+          <w:b/>
+          <w:bCs/>
+          <w:color w:val="1B3A63"/>
+          <w:sz w:val="44"/>
+          <w:szCs w:val="44"/>
+        </w:rPr>
+        <w:t xml:space="preserve">Du cours à une décision professionnelle</w:t>
+      </w:r>
+    </w:p>
+    <w:p>
+      <w:pPr>
+        <w:spacing w:after="40" w:line="260"/>
+      </w:pPr>
+      <w:r>
+        <w:rPr>
+          <w:rFonts w:ascii="Calibri" w:cs="Calibri" w:eastAsia="Calibri" w:hAnsi="Calibri"/>
+          <w:b/>
+          <w:bCs/>
+          <w:color w:val="1B3A63"/>
+          <w:sz w:val="28"/>
+          <w:szCs w:val="28"/>
+        </w:rPr>
+        <w:t xml:space="preserve">D’où vient la situation ?</w:t>
+      </w:r>
+    </w:p>
+    <w:p>
+      <w:pPr>
+        <w:spacing w:after="40" w:line="260"/>
+      </w:pPr>
+      <w:r>
+        <w:rPr>
+          <w:rFonts w:ascii="Calibri" w:cs="Calibri" w:eastAsia="Calibri" w:hAnsi="Calibri"/>
+          <w:color w:val="10233C"/>
+          <w:sz w:val="28"/>
+          <w:szCs w:val="28"/>
+        </w:rPr>
+        <w:t xml:space="preserve">Le carnet fournit une commande fictive. Le QR ouvre le cours associé. Une mission peut rester une analyse qualitative. Si elle demande une fiche machine, un plan, un CCTP ou un relevé absent, le formateur le fournit avant l’activité, ou fait identifier les informations manquantes. On n’invente pas une donnée réelle.</w:t>
+      </w:r>
+    </w:p>
+    <w:p>
+      <w:pPr>
+        <w:spacing w:after="0" w:before="0" w:line="113" w:lineRule="exact"/>
+      </w:pPr>
+    </w:p>
+    <w:p>
+      <w:pPr>
+        <w:spacing w:after="40" w:line="260"/>
+      </w:pPr>
+      <w:r>
+        <w:rPr>
+          <w:rFonts w:ascii="Calibri" w:cs="Calibri" w:eastAsia="Calibri" w:hAnsi="Calibri"/>
+          <w:b/>
+          <w:bCs/>
+          <w:color w:val="1B3A63"/>
+          <w:sz w:val="28"/>
+          <w:szCs w:val="28"/>
+        </w:rPr>
+        <w:t xml:space="preserve">Avec un sujet de BTS ou un chantier d’alternant</w:t>
+      </w:r>
+    </w:p>
+    <w:p>
+      <w:pPr>
+        <w:spacing w:after="40" w:line="260"/>
+      </w:pPr>
+      <w:r>
+        <w:rPr>
+          <w:rFonts w:ascii="Calibri" w:cs="Calibri" w:eastAsia="Calibri" w:hAnsi="Calibri"/>
+          <w:color w:val="10233C"/>
+          <w:sz w:val="28"/>
+          <w:szCs w:val="28"/>
+        </w:rPr>
+        <w:t xml:space="preserve">Conserver l’objectif de la mission et joindre les seules annexes utiles, avec leur origine et leur date. Pour une entreprise : autorisation, anonymisation et retrait des données sensibles. Pour un sujet de BTS : vérifier l’adéquation au TP TECVC. Un corrigé ne fait pas partie du dossier élève.</w:t>
+      </w:r>
+    </w:p>
+    <w:p>
+      <w:pPr>
+        <w:spacing w:after="0" w:before="0" w:line="113" w:lineRule="exact"/>
+      </w:pPr>
+    </w:p>
+    <w:p>
+      <w:pPr>
+        <w:spacing w:after="40" w:line="260"/>
+      </w:pPr>
+      <w:r>
+        <w:rPr>
+          <w:rFonts w:ascii="Calibri" w:cs="Calibri" w:eastAsia="Calibri" w:hAnsi="Calibri"/>
+          <w:b/>
+          <w:bCs/>
+          <w:color w:val="1B3A63"/>
+          <w:sz w:val="28"/>
+          <w:szCs w:val="28"/>
+        </w:rPr>
+        <w:t xml:space="preserve">Une aide qui diminue</w:t>
+      </w:r>
+    </w:p>
+    <w:p>
+      <w:pPr>
+        <w:spacing w:after="40" w:line="260"/>
+      </w:pPr>
+      <w:r>
+        <w:rPr>
+          <w:rFonts w:ascii="Calibri" w:cs="Calibri" w:eastAsia="Calibri" w:hAnsi="Calibri"/>
+          <w:color w:val="10233C"/>
+          <w:sz w:val="28"/>
+          <w:szCs w:val="28"/>
+        </w:rPr>
+        <w:t xml:space="preserve">P1–P2 : les questions indiquent l’écran utile. P3–P5 : chercher soi-même dans le cours ; demander l’indice au professeur si nécessaire. Terminer chaque mission par une justification individuelle, sans le cours, puis expliquer ce qui changerait si une donnée du cas changeait.</w:t>
+      </w:r>
+    </w:p>
+    <w:p>
+      <w:pPr>
+        <w:spacing w:after="0" w:before="0" w:line="113" w:lineRule="exact"/>
+      </w:pPr>
+    </w:p>
+    <w:p>
+      <w:pPr>
+        <w:spacing w:after="40" w:line="260"/>
+      </w:pPr>
+      <w:r>
+        <w:rPr>
+          <w:rFonts w:ascii="Calibri" w:cs="Calibri" w:eastAsia="Calibri" w:hAnsi="Calibri"/>
+          <w:b/>
+          <w:bCs/>
+          <w:color w:val="1B3A63"/>
+          <w:sz w:val="28"/>
+          <w:szCs w:val="28"/>
+        </w:rPr>
+        <w:t xml:space="preserve">Ce qui est évalué</w:t>
+      </w:r>
+    </w:p>
+    <w:p>
+      <w:pPr>
+        <w:spacing w:after="40" w:line="260"/>
+      </w:pPr>
+      <w:r>
+        <w:rPr>
+          <w:rFonts w:ascii="Calibri" w:cs="Calibri" w:eastAsia="Calibri" w:hAnsi="Calibri"/>
+          <w:color w:val="10233C"/>
+          <w:sz w:val="28"/>
+          <w:szCs w:val="28"/>
+        </w:rPr>
+        <w:t xml:space="preserve">Quatre critères : données et limites identifiées ; source pertinente et datée ; raisonnement ou calcul vérifiable ; décision expliquée au client. Le quiz contrôle des connaissances. Le professeur apprécie séparément la production et l’autonomie avec les niveaux 0 à 4. Les badges internes ne délivrent ni diplôme ni habilitation.</w:t>
+      </w:r>
+    </w:p>
+    <w:p>
+      <w:pPr>
+        <w:spacing w:after="0" w:before="0" w:line="113" w:lineRule="exact"/>
+      </w:pPr>
+    </w:p>
+    <w:p>
+      <w:pPr>
+        <w:spacing w:after="40" w:line="260"/>
+      </w:pPr>
+      <w:r>
+        <w:rPr>
+          <w:rFonts w:ascii="Calibri" w:cs="Calibri" w:eastAsia="Calibri" w:hAnsi="Calibri"/>
+          <w:b/>
+          <w:bCs/>
+          <w:color w:val="1B3A63"/>
+          <w:sz w:val="28"/>
+          <w:szCs w:val="28"/>
+        </w:rPr>
+        <w:t xml:space="preserve">Temps et trace</w:t>
+      </w:r>
+    </w:p>
+    <w:p>
+      <w:pPr>
+        <w:spacing w:after="40" w:line="260"/>
+      </w:pPr>
+      <w:r>
+        <w:rPr>
+          <w:rFonts w:ascii="Calibri" w:cs="Calibri" w:eastAsia="Calibri" w:hAnsi="Calibri"/>
+          <w:color w:val="10233C"/>
+          <w:sz w:val="28"/>
+          <w:szCs w:val="28"/>
+        </w:rPr>
+        <w:t xml:space="preserve">Les durées des missions sont des estimations de travail guidé, pas une mesure du temps nécessaire à la maîtrise. Ajouter la recherche documentaire, la correction et l’oral. Rendre les pièces longues sur une feuille jointe : les lignes du carnet servent aussi de brouillon.</w:t>
+      </w:r>
+    </w:p>
+    <w:p>
+      <w:pPr>
+        <w:spacing w:after="0" w:before="0" w:line="113" w:lineRule="exact"/>
+      </w:pPr>
+    </w:p>
+    <w:p>
+      <w:pPr>
+        <w:sectPr>
+          <w:footerReference w:type="default" r:id="rId34"/>
+          <w:pgSz w:w="11906" w:h="16838" w:orient="portrait"/>
+          <w:pgMar w:top="624" w:right="680" w:bottom="1191" w:left="680" w:header="708" w:footer="284" w:gutter="0"/>
+          <w:pgNumType/>
+          <w:docGrid w:linePitch="360"/>
+        </w:sectPr>
+      </w:pPr>
+    </w:p>
+    <w:p>
+      <w:pPr>
+        <w:spacing w:after="100"/>
+      </w:pPr>
+      <w:r>
+        <w:rPr>
+          <w:rFonts w:ascii="Trebuchet MS" w:cs="Trebuchet MS" w:eastAsia="Trebuchet MS" w:hAnsi="Trebuchet MS"/>
+          <w:b/>
+          <w:bCs/>
+          <w:color w:val="1B3A63"/>
+          <w:sz w:val="44"/>
+          <w:szCs w:val="44"/>
+        </w:rPr>
+        <w:t xml:space="preserve">Mission finale : défendre un conseil au client</w:t>
+      </w:r>
+    </w:p>
+    <w:p>
+      <w:pPr>
+        <w:spacing w:after="40" w:line="260"/>
+      </w:pPr>
+      <w:r>
+        <w:rPr>
+          <w:rFonts w:ascii="Calibri" w:cs="Calibri" w:eastAsia="Calibri" w:hAnsi="Calibri"/>
+          <w:b/>
+          <w:bCs/>
+          <w:color w:val="1B3A63"/>
+          <w:sz w:val="28"/>
+          <w:szCs w:val="28"/>
+        </w:rPr>
+        <w:t xml:space="preserve">La commande et les ressources</w:t>
+      </w:r>
+    </w:p>
+    <w:p>
+      <w:pPr>
+        <w:spacing w:after="40" w:line="260"/>
+      </w:pPr>
+      <w:r>
+        <w:rPr>
+          <w:rFonts w:ascii="Calibri" w:cs="Calibri" w:eastAsia="Calibri" w:hAnsi="Calibri"/>
+          <w:color w:val="10233C"/>
+          <w:sz w:val="28"/>
+          <w:szCs w:val="28"/>
+        </w:rPr>
+        <w:t xml:space="preserve">Reprendre le cas fictif PAC chez le voisin, avec ses deux implantations et ses données de calcul. Le propriétaire demande une recommandation compréhensible, les points à vérifier avant travaux et les limites de l’étude. Utiliser le carnet, les cours et leurs sources. Ce dossier réglementaire ne remplace pas le dimensionnement complet d’une installation.</w:t>
+      </w:r>
+    </w:p>
+    <w:p>
+      <w:pPr>
+        <w:spacing w:after="0" w:before="0" w:line="113" w:lineRule="exact"/>
+      </w:pPr>
+    </w:p>
+    <w:p>
+      <w:pPr>
+        <w:spacing w:after="40" w:line="260"/>
+      </w:pPr>
+      <w:r>
+        <w:rPr>
+          <w:rFonts w:ascii="Calibri" w:cs="Calibri" w:eastAsia="Calibri" w:hAnsi="Calibri"/>
+          <w:b/>
+          <w:bCs/>
+          <w:color w:val="1B3A63"/>
+          <w:sz w:val="28"/>
+          <w:szCs w:val="28"/>
+        </w:rPr>
+        <w:t xml:space="preserve">Le travail demandé</w:t>
+      </w:r>
+    </w:p>
+    <w:p>
+      <w:pPr>
+        <w:spacing w:after="40" w:line="260"/>
+      </w:pPr>
+      <w:r>
+        <w:rPr>
+          <w:rFonts w:ascii="Calibri" w:cs="Calibri" w:eastAsia="Calibri" w:hAnsi="Calibri"/>
+          <w:color w:val="10233C"/>
+          <w:sz w:val="28"/>
+          <w:szCs w:val="28"/>
+        </w:rPr>
+        <w:t xml:space="preserve">Préparer individuellement trois pages maximum : 1) schéma d’implantation des deux options et hypothèses ; 2) comparaison acoustique chiffrée et conseil argumenté ; 3) vérifications à effectuer pour les intervenants, le fluide, les déchets et les formalités. Distinguer faits disponibles, hypothèses et pièces à demander. Ne pas appliquer automatiquement la RE2020 à ce remplacement dans l’existant.</w:t>
+      </w:r>
+    </w:p>
+    <w:p>
+      <w:pPr>
+        <w:spacing w:after="0" w:before="0" w:line="113" w:lineRule="exact"/>
+      </w:pPr>
+    </w:p>
+    <w:p>
+      <w:pPr>
+        <w:spacing w:after="40" w:line="260"/>
+      </w:pPr>
+      <w:r>
+        <w:rPr>
+          <w:rFonts w:ascii="Calibri" w:cs="Calibri" w:eastAsia="Calibri" w:hAnsi="Calibri"/>
+          <w:b/>
+          <w:bCs/>
+          <w:color w:val="1B3A63"/>
+          <w:sz w:val="28"/>
+          <w:szCs w:val="28"/>
+        </w:rPr>
+        <w:t xml:space="preserve">Le déroulement</w:t>
+      </w:r>
+    </w:p>
+    <w:p>
+      <w:pPr>
+        <w:spacing w:after="40" w:line="260"/>
+      </w:pPr>
+      <w:r>
+        <w:rPr>
+          <w:rFonts w:ascii="Calibri" w:cs="Calibri" w:eastAsia="Calibri" w:hAnsi="Calibri"/>
+          <w:color w:val="10233C"/>
+          <w:sz w:val="28"/>
+          <w:szCs w:val="28"/>
+        </w:rPr>
+        <w:t xml:space="preserve">Prévoir deux heures de préparation après les missions utiles, puis cinq minutes de présentation et cinq minutes d’échange par élève. Le formateur peut adapter cette durée. Pendant l’oral, il change une donnée du cas : l’élève explique ce qu’il faut recalculer ou revérifier, sans recevoir la solution.</w:t>
+      </w:r>
+    </w:p>
+    <w:p>
+      <w:pPr>
+        <w:spacing w:after="0" w:before="0" w:line="113" w:lineRule="exact"/>
+      </w:pPr>
+    </w:p>
+    <w:p>
+      <w:pPr>
+        <w:spacing w:after="40" w:line="260"/>
+      </w:pPr>
+      <w:r>
+        <w:rPr>
+          <w:rFonts w:ascii="Calibri" w:cs="Calibri" w:eastAsia="Calibri" w:hAnsi="Calibri"/>
+          <w:b/>
+          <w:bCs/>
+          <w:color w:val="1B3A63"/>
+          <w:sz w:val="28"/>
+          <w:szCs w:val="28"/>
+        </w:rPr>
+        <w:t xml:space="preserve">Les critères de réussite</w:t>
+      </w:r>
+    </w:p>
+    <w:p>
+      <w:pPr>
+        <w:spacing w:after="40" w:line="260"/>
+      </w:pPr>
+      <w:r>
+        <w:rPr>
+          <w:rFonts w:ascii="Calibri" w:cs="Calibri" w:eastAsia="Calibri" w:hAnsi="Calibri"/>
+          <w:color w:val="10233C"/>
+          <w:sz w:val="28"/>
+          <w:szCs w:val="28"/>
+        </w:rPr>
+        <w:t xml:space="preserve">Identifier Lw et Lp, montrer la comparaison des implantations et le calcul logarithmique, ne pas transformer une estimation en garantie réglementaire, proposer les vérifications pertinentes et répondre au changement de donnée. Positionner chacun des quatre critères de la page précédente de 0 à 4 ; garder la preuve individuelle et les aides reçues.</w:t>
+      </w:r>
+    </w:p>
+    <w:p>
+      <w:pPr>
+        <w:spacing w:after="0" w:before="0" w:line="113" w:lineRule="exact"/>
+      </w:pPr>
+    </w:p>
+    <w:p>
+      <w:pPr>
+        <w:spacing w:after="40" w:line="260"/>
+      </w:pPr>
+      <w:r>
+        <w:rPr>
+          <w:rFonts w:ascii="Calibri" w:cs="Calibri" w:eastAsia="Calibri" w:hAnsi="Calibri"/>
+          <w:b/>
+          <w:bCs/>
+          <w:color w:val="1B3A63"/>
+          <w:sz w:val="28"/>
+          <w:szCs w:val="28"/>
+        </w:rPr>
+        <w:t xml:space="preserve">Le lien avec le TP TECVC</w:t>
+      </w:r>
+    </w:p>
+    <w:p>
+      <w:pPr>
+        <w:spacing w:after="40" w:line="260"/>
+      </w:pPr>
+      <w:r>
+        <w:rPr>
+          <w:rFonts w:ascii="Calibri" w:cs="Calibri" w:eastAsia="Calibri" w:hAnsi="Calibri"/>
+          <w:color w:val="10233C"/>
+          <w:sz w:val="28"/>
+          <w:szCs w:val="28"/>
+        </w:rPr>
+        <w:t xml:space="preserve">Cette activité apporte des éléments sur l’implantation et la justification de choix CVC. Une simple note réglementaire ne prouve pas à elle seule la maîtrise complète des CP du référentiel. Le professeur croise ces observations avec les études techniques et les autres évaluations de la formation.</w:t>
+      </w:r>
+    </w:p>
+    <w:p>
+      <w:pPr>
+        <w:spacing w:after="0" w:before="0" w:line="113" w:lineRule="exact"/>
+      </w:pPr>
+    </w:p>
     <w:sectPr>
-      <w:footerReference w:type="default" r:id="rId33"/>
+      <w:footerReference w:type="default" r:id="rId35"/>
       <w:pgSz w:w="11906" w:h="16838" w:orient="portrait"/>
       <w:pgMar w:top="624" w:right="680" w:bottom="1191" w:left="680" w:header="708" w:footer="284" w:gutter="0"/>
       <w:pgNumType/>
@@ -24744,6 +25148,55 @@
 </w:ftr>
 </file>
 
+<file path=word/footer29.xml><?xml version="1.0" encoding="utf-8"?>
+<w:ftr xmlns:wpc="http://schemas.microsoft.com/office/word/2010/wordprocessingCanvas" xmlns:mc="http://schemas.openxmlformats.org/markup-compatibility/2006" xmlns:o="urn:schemas-microsoft-com:office:office" xmlns:r="http://schemas.openxmlformats.org/officeDocument/2006/relationships" xmlns:m="http://schemas.openxmlformats.org/officeDocument/2006/math" xmlns:v="urn:schemas-microsoft-com:vml" xmlns:wp14="http://schemas.microsoft.com/office/word/2010/wordprocessingDrawing" xmlns:wp="http://schemas.openxmlformats.org/drawingml/2006/wordprocessingDrawing" xmlns:w10="urn:schemas-microsoft-com:office:word" xmlns:w="http://schemas.openxmlformats.org/wordprocessingml/2006/main" xmlns:w14="http://schemas.microsoft.com/office/word/2010/wordml" xmlns:w15="http://schemas.microsoft.com/office/word/2012/wordml" xmlns:wpg="http://schemas.microsoft.com/office/word/2010/wordprocessingGroup" xmlns:wpi="http://schemas.microsoft.com/office/word/2010/wordprocessingInk" xmlns:wne="http://schemas.microsoft.com/office/word/2006/wordml" xmlns:wps="http://schemas.microsoft.com/office/word/2010/wordprocessingShape">
+  <w:p>
+    <w:pPr>
+      <w:pBdr>
+        <w:top w:val="single" w:color="E8914A" w:sz="8" w:space="3"/>
+      </w:pBdr>
+      <w:spacing w:after="0"/>
+    </w:pPr>
+    <w:r>
+      <w:rPr>
+        <w:rFonts w:ascii="Calibri" w:cs="Calibri" w:eastAsia="Calibri" w:hAnsi="Calibri"/>
+        <w:b/>
+        <w:bCs/>
+        <w:color w:val="1B3A63"/>
+        <w:sz w:val="28"/>
+        <w:szCs w:val="28"/>
+      </w:rPr>
+      <w:t xml:space="preserve">TP TECVC · critères et autonomie</w:t>
+    </w:r>
+  </w:p>
+  <w:p>
+    <w:pPr>
+      <w:tabs>
+        <w:tab w:val="right" w:pos="10546"/>
+      </w:tabs>
+    </w:pPr>
+    <w:r>
+      <w:rPr>
+        <w:rFonts w:ascii="Calibri" w:cs="Calibri" w:eastAsia="Calibri" w:hAnsi="Calibri"/>
+        <w:color w:val="56657A"/>
+        <w:sz w:val="28"/>
+        <w:szCs w:val="28"/>
+      </w:rPr>
+      <w:t xml:space="preserve">inerWeb · Législation · Clim’Études Sud</w:t>
+    </w:r>
+    <w:r>
+      <w:rPr>
+        <w:rFonts w:ascii="Calibri" w:cs="Calibri" w:eastAsia="Calibri" w:hAnsi="Calibri"/>
+        <w:color w:val="56657A"/>
+        <w:sz w:val="28"/>
+        <w:szCs w:val="28"/>
+      </w:rPr>
+      <w:t xml:space="preserve">	guide pédagogique</w:t>
+    </w:r>
+  </w:p>
+</w:ftr>
+</file>
+
 <file path=word/footer3.xml><?xml version="1.0" encoding="utf-8"?>
 <w:ftr xmlns:wpc="http://schemas.microsoft.com/office/word/2010/wordprocessingCanvas" xmlns:mc="http://schemas.openxmlformats.org/markup-compatibility/2006" xmlns:o="urn:schemas-microsoft-com:office:office" xmlns:r="http://schemas.openxmlformats.org/officeDocument/2006/relationships" xmlns:m="http://schemas.openxmlformats.org/officeDocument/2006/math" xmlns:v="urn:schemas-microsoft-com:vml" xmlns:wp14="http://schemas.microsoft.com/office/word/2010/wordprocessingDrawing" xmlns:wp="http://schemas.openxmlformats.org/drawingml/2006/wordprocessingDrawing" xmlns:w10="urn:schemas-microsoft-com:office:word" xmlns:w="http://schemas.openxmlformats.org/wordprocessingml/2006/main" xmlns:w14="http://schemas.microsoft.com/office/word/2010/wordml" xmlns:w15="http://schemas.microsoft.com/office/word/2012/wordml" xmlns:wpg="http://schemas.microsoft.com/office/word/2010/wordprocessingGroup" xmlns:wpi="http://schemas.microsoft.com/office/word/2010/wordprocessingInk" xmlns:wne="http://schemas.microsoft.com/office/word/2006/wordml" xmlns:wps="http://schemas.microsoft.com/office/word/2010/wordprocessingShape">
   <w:p>
@@ -24788,6 +25241,55 @@
         <w:szCs w:val="28"/>
       </w:rPr>
       <w:t xml:space="preserve">	mission 1/57 · recto</w:t>
+    </w:r>
+  </w:p>
+</w:ftr>
+</file>
+
+<file path=word/footer30.xml><?xml version="1.0" encoding="utf-8"?>
+<w:ftr xmlns:wpc="http://schemas.microsoft.com/office/word/2010/wordprocessingCanvas" xmlns:mc="http://schemas.openxmlformats.org/markup-compatibility/2006" xmlns:o="urn:schemas-microsoft-com:office:office" xmlns:r="http://schemas.openxmlformats.org/officeDocument/2006/relationships" xmlns:m="http://schemas.openxmlformats.org/officeDocument/2006/math" xmlns:v="urn:schemas-microsoft-com:vml" xmlns:wp14="http://schemas.microsoft.com/office/word/2010/wordprocessingDrawing" xmlns:wp="http://schemas.openxmlformats.org/drawingml/2006/wordprocessingDrawing" xmlns:w10="urn:schemas-microsoft-com:office:word" xmlns:w="http://schemas.openxmlformats.org/wordprocessingml/2006/main" xmlns:w14="http://schemas.microsoft.com/office/word/2010/wordml" xmlns:w15="http://schemas.microsoft.com/office/word/2012/wordml" xmlns:wpg="http://schemas.microsoft.com/office/word/2010/wordprocessingGroup" xmlns:wpi="http://schemas.microsoft.com/office/word/2010/wordprocessingInk" xmlns:wne="http://schemas.microsoft.com/office/word/2006/wordml" xmlns:wps="http://schemas.microsoft.com/office/word/2010/wordprocessingShape">
+  <w:p>
+    <w:pPr>
+      <w:pBdr>
+        <w:top w:val="single" w:color="E8914A" w:sz="8" w:space="3"/>
+      </w:pBdr>
+      <w:spacing w:after="0"/>
+    </w:pPr>
+    <w:r>
+      <w:rPr>
+        <w:rFonts w:ascii="Calibri" w:cs="Calibri" w:eastAsia="Calibri" w:hAnsi="Calibri"/>
+        <w:b/>
+        <w:bCs/>
+        <w:color w:val="1B3A63"/>
+        <w:sz w:val="28"/>
+        <w:szCs w:val="28"/>
+      </w:rPr>
+      <w:t xml:space="preserve">TP TECVC · critères et autonomie</w:t>
+    </w:r>
+  </w:p>
+  <w:p>
+    <w:pPr>
+      <w:tabs>
+        <w:tab w:val="right" w:pos="10546"/>
+      </w:tabs>
+    </w:pPr>
+    <w:r>
+      <w:rPr>
+        <w:rFonts w:ascii="Calibri" w:cs="Calibri" w:eastAsia="Calibri" w:hAnsi="Calibri"/>
+        <w:color w:val="56657A"/>
+        <w:sz w:val="28"/>
+        <w:szCs w:val="28"/>
+      </w:rPr>
+      <w:t xml:space="preserve">inerWeb · Législation · Clim’Études Sud</w:t>
+    </w:r>
+    <w:r>
+      <w:rPr>
+        <w:rFonts w:ascii="Calibri" w:cs="Calibri" w:eastAsia="Calibri" w:hAnsi="Calibri"/>
+        <w:color w:val="56657A"/>
+        <w:sz w:val="28"/>
+        <w:szCs w:val="28"/>
+      </w:rPr>
+      <w:t xml:space="preserve">	guide pédagogique</w:t>
     </w:r>
   </w:p>
 </w:ftr>

</xml_diff>